<commit_message>
copia 2 de documento de word
</commit_message>
<xml_diff>
--- a/Github/Github.docx
+++ b/Github/Github.docx
@@ -11,36 +11,1285 @@
           <w:lang w:val="es-MX"/>
         </w:rPr>
       </w:pPr>
-      <w:proofErr w:type="spellStart"/>
       <w:r>
         <w:rPr>
           <w:sz w:val="52"/>
           <w:szCs w:val="52"/>
           <w:lang w:val="es-MX"/>
         </w:rPr>
-        <w:t>Git</w:t>
-      </w:r>
-      <w:proofErr w:type="spellEnd"/>
-      <w:r>
-        <w:rPr>
-          <w:sz w:val="52"/>
-          <w:szCs w:val="52"/>
-          <w:lang w:val="es-MX"/>
-        </w:rPr>
-        <w:t xml:space="preserve"> &amp; </w:t>
-      </w:r>
-      <w:proofErr w:type="spellStart"/>
-      <w:r>
-        <w:rPr>
-          <w:sz w:val="52"/>
-          <w:szCs w:val="52"/>
-          <w:lang w:val="es-MX"/>
-        </w:rPr>
-        <w:t>Github</w:t>
+        <w:t>Git &amp; Github</w:t>
+      </w:r>
+    </w:p>
+    <w:p>
+      <w:pPr>
+        <w:spacing w:line="240" w:lineRule="auto"/>
+        <w:rPr>
+          <w:rFonts w:ascii="Arial" w:eastAsia="Times New Roman" w:hAnsi="Arial" w:cs="Arial"/>
+          <w:b/>
+          <w:bCs/>
+          <w:sz w:val="30"/>
+          <w:szCs w:val="30"/>
+          <w:lang w:eastAsia="es-AR"/>
+        </w:rPr>
+      </w:pPr>
+      <w:r>
+        <w:rPr>
+          <w:rFonts w:ascii="Segoe UI Symbol" w:eastAsia="Times New Roman" w:hAnsi="Segoe UI Symbol" w:cs="Segoe UI Symbol"/>
+          <w:b/>
+          <w:bCs/>
+          <w:sz w:val="30"/>
+          <w:szCs w:val="30"/>
+          <w:lang w:eastAsia="es-AR"/>
+        </w:rPr>
+        <w:t>💻</w:t>
+      </w:r>
+      <w:r>
+        <w:rPr>
+          <w:rFonts w:ascii="Arial" w:eastAsia="Times New Roman" w:hAnsi="Arial" w:cs="Arial"/>
+          <w:b/>
+          <w:bCs/>
+          <w:sz w:val="30"/>
+          <w:szCs w:val="30"/>
+          <w:lang w:eastAsia="es-AR"/>
+        </w:rPr>
+        <w:t xml:space="preserve"> ¿Qué es Git?</w:t>
+      </w:r>
+    </w:p>
+    <w:p>
+      <w:pPr>
+        <w:spacing w:line="240" w:lineRule="auto"/>
+        <w:rPr>
+          <w:rFonts w:ascii="Arial" w:eastAsia="Times New Roman" w:hAnsi="Arial" w:cs="Arial"/>
+          <w:sz w:val="24"/>
+          <w:szCs w:val="24"/>
+          <w:lang w:eastAsia="es-AR"/>
+        </w:rPr>
+      </w:pPr>
+      <w:r>
+        <w:rPr>
+          <w:rFonts w:ascii="Arial" w:eastAsia="Times New Roman" w:hAnsi="Arial" w:cs="Arial"/>
+          <w:sz w:val="24"/>
+          <w:szCs w:val="24"/>
+          <w:lang w:eastAsia="es-AR"/>
+        </w:rPr>
+        <w:t xml:space="preserve">Git es un software libre y de código abierto creado por Linus Torvalds en 2005. Su función principal es el </w:t>
+      </w:r>
+      <w:r>
+        <w:rPr>
+          <w:rFonts w:ascii="Arial" w:eastAsia="Times New Roman" w:hAnsi="Arial" w:cs="Arial"/>
+          <w:b/>
+          <w:bCs/>
+          <w:sz w:val="24"/>
+          <w:szCs w:val="24"/>
+          <w:lang w:eastAsia="es-AR"/>
+        </w:rPr>
+        <w:t>control de versiones</w:t>
+      </w:r>
+      <w:r>
+        <w:rPr>
+          <w:rFonts w:ascii="Arial" w:eastAsia="Times New Roman" w:hAnsi="Arial" w:cs="Arial"/>
+          <w:sz w:val="24"/>
+          <w:szCs w:val="24"/>
+          <w:lang w:eastAsia="es-AR"/>
+        </w:rPr>
+        <w:t>.</w:t>
+      </w:r>
+    </w:p>
+    <w:p>
+      <w:pPr>
+        <w:numPr>
+          <w:ilvl w:val="0"/>
+          <w:numId w:val="1"/>
+        </w:numPr>
+        <w:spacing w:after="0" w:line="240" w:lineRule="auto"/>
+        <w:ind w:left="0"/>
+        <w:rPr>
+          <w:rFonts w:ascii="Arial" w:eastAsia="Times New Roman" w:hAnsi="Arial" w:cs="Arial"/>
+          <w:sz w:val="24"/>
+          <w:szCs w:val="24"/>
+          <w:lang w:eastAsia="es-AR"/>
+        </w:rPr>
+      </w:pPr>
+      <w:r>
+        <w:rPr>
+          <w:rFonts w:ascii="Arial" w:eastAsia="Times New Roman" w:hAnsi="Arial" w:cs="Arial"/>
+          <w:b/>
+          <w:bCs/>
+          <w:sz w:val="24"/>
+          <w:szCs w:val="24"/>
+          <w:lang w:eastAsia="es-AR"/>
+        </w:rPr>
+        <w:t>Historial completo</w:t>
+      </w:r>
+      <w:r>
+        <w:rPr>
+          <w:rFonts w:ascii="Arial" w:eastAsia="Times New Roman" w:hAnsi="Arial" w:cs="Arial"/>
+          <w:sz w:val="24"/>
+          <w:szCs w:val="24"/>
+          <w:lang w:eastAsia="es-AR"/>
+        </w:rPr>
+        <w:t xml:space="preserve">: Funciona como una máquina del tiempo que toma "fotografías" (llamadas </w:t>
+      </w:r>
+      <w:r>
+        <w:rPr>
+          <w:rFonts w:ascii="Arial" w:eastAsia="Times New Roman" w:hAnsi="Arial" w:cs="Arial"/>
+          <w:i/>
+          <w:iCs/>
+          <w:sz w:val="24"/>
+          <w:szCs w:val="24"/>
+          <w:lang w:eastAsia="es-AR"/>
+        </w:rPr>
+        <w:t>commits</w:t>
+      </w:r>
+      <w:r>
+        <w:rPr>
+          <w:rFonts w:ascii="Arial" w:eastAsia="Times New Roman" w:hAnsi="Arial" w:cs="Arial"/>
+          <w:sz w:val="24"/>
+          <w:szCs w:val="24"/>
+          <w:lang w:eastAsia="es-AR"/>
+        </w:rPr>
+        <w:t>) de tu código. Puedes regresar a cualquier versión anterior si algo falla.</w:t>
+      </w:r>
+    </w:p>
+    <w:p>
+      <w:pPr>
+        <w:numPr>
+          <w:ilvl w:val="0"/>
+          <w:numId w:val="1"/>
+        </w:numPr>
+        <w:spacing w:after="0" w:line="240" w:lineRule="auto"/>
+        <w:ind w:left="0"/>
+        <w:rPr>
+          <w:rFonts w:ascii="Arial" w:eastAsia="Times New Roman" w:hAnsi="Arial" w:cs="Arial"/>
+          <w:sz w:val="24"/>
+          <w:szCs w:val="24"/>
+          <w:lang w:eastAsia="es-AR"/>
+        </w:rPr>
+      </w:pPr>
+      <w:r>
+        <w:rPr>
+          <w:rFonts w:ascii="Arial" w:eastAsia="Times New Roman" w:hAnsi="Arial" w:cs="Arial"/>
+          <w:b/>
+          <w:bCs/>
+          <w:sz w:val="24"/>
+          <w:szCs w:val="24"/>
+          <w:lang w:eastAsia="es-AR"/>
+        </w:rPr>
+        <w:t>Trabajo en ramas (</w:t>
+      </w:r>
+      <w:r>
+        <w:rPr>
+          <w:rFonts w:ascii="Arial" w:eastAsia="Times New Roman" w:hAnsi="Arial" w:cs="Arial"/>
+          <w:b/>
+          <w:bCs/>
+          <w:i/>
+          <w:iCs/>
+          <w:sz w:val="24"/>
+          <w:szCs w:val="24"/>
+          <w:lang w:eastAsia="es-AR"/>
+        </w:rPr>
+        <w:t>Branches</w:t>
+      </w:r>
+      <w:r>
+        <w:rPr>
+          <w:rFonts w:ascii="Arial" w:eastAsia="Times New Roman" w:hAnsi="Arial" w:cs="Arial"/>
+          <w:b/>
+          <w:bCs/>
+          <w:sz w:val="24"/>
+          <w:szCs w:val="24"/>
+          <w:lang w:eastAsia="es-AR"/>
+        </w:rPr>
+        <w:t>)</w:t>
+      </w:r>
+      <w:r>
+        <w:rPr>
+          <w:rFonts w:ascii="Arial" w:eastAsia="Times New Roman" w:hAnsi="Arial" w:cs="Arial"/>
+          <w:sz w:val="24"/>
+          <w:szCs w:val="24"/>
+          <w:lang w:eastAsia="es-AR"/>
+        </w:rPr>
+        <w:t>: Permite duplicar el proyecto para probar nuevas funciones en paralelo sin alterar el código principal que ya funciona.</w:t>
+      </w:r>
+    </w:p>
+    <w:p>
+      <w:pPr>
+        <w:numPr>
+          <w:ilvl w:val="0"/>
+          <w:numId w:val="1"/>
+        </w:numPr>
+        <w:spacing w:after="0" w:line="240" w:lineRule="auto"/>
+        <w:ind w:left="0"/>
+        <w:rPr>
+          <w:rFonts w:ascii="Arial" w:eastAsia="Times New Roman" w:hAnsi="Arial" w:cs="Arial"/>
+          <w:sz w:val="24"/>
+          <w:szCs w:val="24"/>
+          <w:lang w:eastAsia="es-AR"/>
+        </w:rPr>
+      </w:pPr>
+      <w:r>
+        <w:rPr>
+          <w:rFonts w:ascii="Arial" w:eastAsia="Times New Roman" w:hAnsi="Arial" w:cs="Arial"/>
+          <w:b/>
+          <w:bCs/>
+          <w:sz w:val="24"/>
+          <w:szCs w:val="24"/>
+          <w:lang w:eastAsia="es-AR"/>
+        </w:rPr>
+        <w:t>Funcionamiento local</w:t>
+      </w:r>
+      <w:r>
+        <w:rPr>
+          <w:rFonts w:ascii="Arial" w:eastAsia="Times New Roman" w:hAnsi="Arial" w:cs="Arial"/>
+          <w:sz w:val="24"/>
+          <w:szCs w:val="24"/>
+          <w:lang w:eastAsia="es-AR"/>
+        </w:rPr>
+        <w:t>: Se ejecuta directamente en el disco duro de tu computadora y no requiere conexión a internet para registrar tus cambios.</w:t>
+      </w:r>
+      <w:r>
+        <w:rPr>
+          <w:rFonts w:ascii="Arial" w:eastAsia="Times New Roman" w:hAnsi="Arial" w:cs="Arial"/>
+          <w:sz w:val="24"/>
+          <w:szCs w:val="24"/>
+          <w:lang w:eastAsia="es-AR"/>
+        </w:rPr>
+        <w:t xml:space="preserve"> </w:t>
+      </w:r>
+    </w:p>
+    <w:p>
+      <w:pPr>
+        <w:spacing w:line="240" w:lineRule="auto"/>
+        <w:rPr>
+          <w:rFonts w:ascii="Arial" w:eastAsia="Times New Roman" w:hAnsi="Arial" w:cs="Arial"/>
+          <w:b/>
+          <w:bCs/>
+          <w:sz w:val="30"/>
+          <w:szCs w:val="30"/>
+          <w:lang w:eastAsia="es-AR"/>
+        </w:rPr>
+      </w:pPr>
+      <w:r>
+        <w:rPr>
+          <w:rFonts w:ascii="Segoe UI Symbol" w:eastAsia="Times New Roman" w:hAnsi="Segoe UI Symbol" w:cs="Segoe UI Symbol"/>
+          <w:b/>
+          <w:bCs/>
+          <w:sz w:val="30"/>
+          <w:szCs w:val="30"/>
+          <w:lang w:eastAsia="es-AR"/>
+        </w:rPr>
+        <w:t>🌐</w:t>
+      </w:r>
+      <w:r>
+        <w:rPr>
+          <w:rFonts w:ascii="Arial" w:eastAsia="Times New Roman" w:hAnsi="Arial" w:cs="Arial"/>
+          <w:b/>
+          <w:bCs/>
+          <w:sz w:val="30"/>
+          <w:szCs w:val="30"/>
+          <w:lang w:eastAsia="es-AR"/>
+        </w:rPr>
+        <w:t xml:space="preserve"> ¿Qué es GitHub?</w:t>
+      </w:r>
+    </w:p>
+    <w:p>
+      <w:pPr>
+        <w:spacing w:line="240" w:lineRule="auto"/>
+        <w:rPr>
+          <w:rFonts w:ascii="Arial" w:eastAsia="Times New Roman" w:hAnsi="Arial" w:cs="Arial"/>
+          <w:sz w:val="24"/>
+          <w:szCs w:val="24"/>
+          <w:lang w:eastAsia="es-AR"/>
+        </w:rPr>
+      </w:pPr>
+      <w:r>
+        <w:rPr>
+          <w:rFonts w:ascii="Arial" w:eastAsia="Times New Roman" w:hAnsi="Arial" w:cs="Arial"/>
+          <w:sz w:val="24"/>
+          <w:szCs w:val="24"/>
+          <w:lang w:eastAsia="es-AR"/>
+        </w:rPr>
+        <w:t xml:space="preserve">GitHub </w:t>
+      </w:r>
+      <w:r>
+        <w:rPr>
+          <w:rFonts w:ascii="Arial" w:eastAsia="Times New Roman" w:hAnsi="Arial" w:cs="Arial"/>
+          <w:sz w:val="24"/>
+          <w:szCs w:val="24"/>
+          <w:lang w:eastAsia="es-AR"/>
+        </w:rPr>
+        <w:t xml:space="preserve">es un servicio de alojamiento en la nube (comprado por Microsoft en 2018) que se conecta con Git </w:t>
+      </w:r>
+      <w:r>
+        <w:rPr>
+          <w:rFonts w:ascii="Arial" w:eastAsia="Times New Roman" w:hAnsi="Arial" w:cs="Arial"/>
+          <w:sz w:val="24"/>
+          <w:szCs w:val="24"/>
+          <w:lang w:eastAsia="es-AR"/>
+        </w:rPr>
+        <w:t xml:space="preserve">para guardar tus repositorios. </w:t>
+      </w:r>
+    </w:p>
+    <w:p>
+      <w:pPr>
+        <w:numPr>
+          <w:ilvl w:val="0"/>
+          <w:numId w:val="2"/>
+        </w:numPr>
+        <w:spacing w:after="0" w:line="240" w:lineRule="auto"/>
+        <w:ind w:left="0"/>
+        <w:rPr>
+          <w:rFonts w:ascii="Arial" w:eastAsia="Times New Roman" w:hAnsi="Arial" w:cs="Arial"/>
+          <w:sz w:val="24"/>
+          <w:szCs w:val="24"/>
+          <w:lang w:eastAsia="es-AR"/>
+        </w:rPr>
+      </w:pPr>
+      <w:r>
+        <w:rPr>
+          <w:rFonts w:ascii="Arial" w:eastAsia="Times New Roman" w:hAnsi="Arial" w:cs="Arial"/>
+          <w:b/>
+          <w:bCs/>
+          <w:sz w:val="24"/>
+          <w:szCs w:val="24"/>
+          <w:lang w:eastAsia="es-AR"/>
+        </w:rPr>
+        <w:t>Nube segura</w:t>
+      </w:r>
+      <w:r>
+        <w:rPr>
+          <w:rFonts w:ascii="Arial" w:eastAsia="Times New Roman" w:hAnsi="Arial" w:cs="Arial"/>
+          <w:sz w:val="24"/>
+          <w:szCs w:val="24"/>
+          <w:lang w:eastAsia="es-AR"/>
+        </w:rPr>
+        <w:t>: Sirve como respaldo de tus proyectos; si tu computadora se rompe, tu código sigue a salvo en internet.</w:t>
+      </w:r>
+    </w:p>
+    <w:p>
+      <w:pPr>
+        <w:numPr>
+          <w:ilvl w:val="0"/>
+          <w:numId w:val="2"/>
+        </w:numPr>
+        <w:spacing w:after="0" w:line="240" w:lineRule="auto"/>
+        <w:ind w:left="0"/>
+        <w:rPr>
+          <w:rFonts w:ascii="Arial" w:eastAsia="Times New Roman" w:hAnsi="Arial" w:cs="Arial"/>
+          <w:sz w:val="24"/>
+          <w:szCs w:val="24"/>
+          <w:lang w:eastAsia="es-AR"/>
+        </w:rPr>
+      </w:pPr>
+      <w:r>
+        <w:rPr>
+          <w:rFonts w:ascii="Arial" w:eastAsia="Times New Roman" w:hAnsi="Arial" w:cs="Arial"/>
+          <w:b/>
+          <w:bCs/>
+          <w:sz w:val="24"/>
+          <w:szCs w:val="24"/>
+          <w:lang w:eastAsia="es-AR"/>
+        </w:rPr>
+        <w:t>Colaboración masiva</w:t>
+      </w:r>
+      <w:r>
+        <w:rPr>
+          <w:rFonts w:ascii="Arial" w:eastAsia="Times New Roman" w:hAnsi="Arial" w:cs="Arial"/>
+          <w:sz w:val="24"/>
+          <w:szCs w:val="24"/>
+          <w:lang w:eastAsia="es-AR"/>
+        </w:rPr>
+        <w:t xml:space="preserve">: Facilita que programadores de todo el mundo trabajen juntos en el mismo archivo mediante herramientas como las </w:t>
+      </w:r>
+      <w:r>
+        <w:rPr>
+          <w:rFonts w:ascii="Arial" w:eastAsia="Times New Roman" w:hAnsi="Arial" w:cs="Arial"/>
+          <w:i/>
+          <w:iCs/>
+          <w:sz w:val="24"/>
+          <w:szCs w:val="24"/>
+          <w:lang w:eastAsia="es-AR"/>
+        </w:rPr>
+        <w:t>Pull Requests</w:t>
+      </w:r>
+      <w:r>
+        <w:rPr>
+          <w:rFonts w:ascii="Arial" w:eastAsia="Times New Roman" w:hAnsi="Arial" w:cs="Arial"/>
+          <w:sz w:val="24"/>
+          <w:szCs w:val="24"/>
+          <w:lang w:eastAsia="es-AR"/>
+        </w:rPr>
+        <w:t xml:space="preserve"> (solicitudes para integrar tus mejoras al proyecto original).</w:t>
+      </w:r>
+    </w:p>
+    <w:p>
+      <w:pPr>
+        <w:numPr>
+          <w:ilvl w:val="0"/>
+          <w:numId w:val="2"/>
+        </w:numPr>
+        <w:spacing w:after="0" w:line="240" w:lineRule="auto"/>
+        <w:ind w:left="0"/>
+        <w:rPr>
+          <w:rFonts w:ascii="Arial" w:eastAsia="Times New Roman" w:hAnsi="Arial" w:cs="Arial"/>
+          <w:sz w:val="24"/>
+          <w:szCs w:val="24"/>
+          <w:lang w:eastAsia="es-AR"/>
+        </w:rPr>
+      </w:pPr>
+      <w:r>
+        <w:rPr>
+          <w:rFonts w:ascii="Arial" w:eastAsia="Times New Roman" w:hAnsi="Arial" w:cs="Arial"/>
+          <w:b/>
+          <w:bCs/>
+          <w:sz w:val="24"/>
+          <w:szCs w:val="24"/>
+          <w:lang w:eastAsia="es-AR"/>
+        </w:rPr>
+        <w:t>Portafolio digital</w:t>
+      </w:r>
+      <w:r>
+        <w:rPr>
+          <w:rFonts w:ascii="Arial" w:eastAsia="Times New Roman" w:hAnsi="Arial" w:cs="Arial"/>
+          <w:sz w:val="24"/>
+          <w:szCs w:val="24"/>
+          <w:lang w:eastAsia="es-AR"/>
+        </w:rPr>
+        <w:t>: Funciona como una carta de presentación donde reclutadores y otros desarrolladores pueden ver la calidad de tus proyectos públicos.</w:t>
+      </w:r>
+      <w:r>
+        <w:rPr>
+          <w:rFonts w:ascii="Arial" w:eastAsia="Times New Roman" w:hAnsi="Arial" w:cs="Arial"/>
+          <w:sz w:val="24"/>
+          <w:szCs w:val="24"/>
+          <w:lang w:eastAsia="es-AR"/>
+        </w:rPr>
+        <w:t xml:space="preserve"> </w:t>
+      </w:r>
+    </w:p>
+    <w:p>
+      <w:pPr>
+        <w:spacing w:before="480" w:after="480" w:line="240" w:lineRule="auto"/>
+        <w:rPr>
+          <w:rFonts w:ascii="Times New Roman" w:eastAsia="Times New Roman" w:hAnsi="Times New Roman" w:cs="Times New Roman"/>
+          <w:sz w:val="24"/>
+          <w:szCs w:val="24"/>
+          <w:lang w:eastAsia="es-AR"/>
+        </w:rPr>
+      </w:pPr>
+      <w:r>
+        <w:rPr>
+          <w:rFonts w:ascii="Times New Roman" w:eastAsia="Times New Roman" w:hAnsi="Times New Roman" w:cs="Times New Roman"/>
+          <w:sz w:val="24"/>
+          <w:szCs w:val="24"/>
+          <w:lang w:eastAsia="es-AR"/>
+        </w:rPr>
+        <w:pict>
+          <v:rect id="_x0000_i1025" style="width:0;height:1.5pt" o:hralign="center" o:hrstd="t" o:hr="t" fillcolor="#a0a0a0" stroked="f"/>
+        </w:pict>
+      </w:r>
+    </w:p>
+    <w:p>
+      <w:pPr>
+        <w:spacing w:before="480" w:after="480" w:line="240" w:lineRule="auto"/>
+        <w:rPr>
+          <w:rFonts w:ascii="Arial" w:eastAsia="Times New Roman" w:hAnsi="Arial" w:cs="Arial"/>
+          <w:b/>
+          <w:bCs/>
+          <w:sz w:val="30"/>
+          <w:szCs w:val="30"/>
+          <w:lang w:eastAsia="es-AR"/>
+        </w:rPr>
+      </w:pPr>
+      <w:r>
+        <w:rPr>
+          <w:rFonts w:ascii="Segoe UI Symbol" w:eastAsia="Times New Roman" w:hAnsi="Segoe UI Symbol" w:cs="Segoe UI Symbol"/>
+          <w:b/>
+          <w:bCs/>
+          <w:sz w:val="30"/>
+          <w:szCs w:val="30"/>
+          <w:lang w:eastAsia="es-AR"/>
+        </w:rPr>
+        <w:t>📊</w:t>
+      </w:r>
+      <w:r>
+        <w:rPr>
+          <w:rFonts w:ascii="Arial" w:eastAsia="Times New Roman" w:hAnsi="Arial" w:cs="Arial"/>
+          <w:b/>
+          <w:bCs/>
+          <w:sz w:val="30"/>
+          <w:szCs w:val="30"/>
+          <w:lang w:eastAsia="es-AR"/>
+        </w:rPr>
+        <w:t xml:space="preserve"> Resumen de diferencias</w:t>
+      </w:r>
+    </w:p>
+    <w:tbl>
+      <w:tblPr>
+        <w:tblW w:w="0" w:type="auto"/>
+        <w:tblCellSpacing w:w="15" w:type="dxa"/>
+        <w:tblCellMar>
+          <w:top w:w="15" w:type="dxa"/>
+          <w:left w:w="15" w:type="dxa"/>
+          <w:bottom w:w="15" w:type="dxa"/>
+          <w:right w:w="15" w:type="dxa"/>
+        </w:tblCellMar>
+        <w:tblLook w:val="04A0" w:firstRow="1" w:lastRow="0" w:firstColumn="1" w:lastColumn="0" w:noHBand="0" w:noVBand="1"/>
+      </w:tblPr>
+      <w:tblGrid>
+        <w:gridCol w:w="1465"/>
+        <w:gridCol w:w="3255"/>
+        <w:gridCol w:w="3784"/>
+      </w:tblGrid>
+      <w:tr>
+        <w:trPr>
+          <w:tblCellSpacing w:w="15" w:type="dxa"/>
+        </w:trPr>
+        <w:tc>
+          <w:tcPr>
+            <w:tcW w:w="0" w:type="auto"/>
+            <w:tcBorders>
+              <w:bottom w:val="single" w:sz="6" w:space="0" w:color="DCDFE5"/>
+            </w:tcBorders>
+            <w:vAlign w:val="center"/>
+            <w:hideMark/>
+          </w:tcPr>
+          <w:p>
+            <w:pPr>
+              <w:spacing w:after="0" w:line="240" w:lineRule="auto"/>
+              <w:jc w:val="center"/>
+              <w:rPr>
+                <w:rFonts w:ascii="Arial" w:eastAsia="Times New Roman" w:hAnsi="Arial" w:cs="Arial"/>
+                <w:b/>
+                <w:bCs/>
+                <w:sz w:val="21"/>
+                <w:szCs w:val="21"/>
+                <w:lang w:eastAsia="es-AR"/>
+              </w:rPr>
+            </w:pPr>
+            <w:r>
+              <w:rPr>
+                <w:rFonts w:ascii="Arial" w:eastAsia="Times New Roman" w:hAnsi="Arial" w:cs="Arial"/>
+                <w:b/>
+                <w:bCs/>
+                <w:sz w:val="21"/>
+                <w:szCs w:val="21"/>
+                <w:lang w:eastAsia="es-AR"/>
+              </w:rPr>
+              <w:t xml:space="preserve">Característica </w:t>
+            </w:r>
+          </w:p>
+        </w:tc>
+        <w:tc>
+          <w:tcPr>
+            <w:tcW w:w="0" w:type="auto"/>
+            <w:tcBorders>
+              <w:bottom w:val="single" w:sz="6" w:space="0" w:color="DCDFE5"/>
+            </w:tcBorders>
+            <w:vAlign w:val="center"/>
+            <w:hideMark/>
+          </w:tcPr>
+          <w:p>
+            <w:pPr>
+              <w:spacing w:after="0" w:line="240" w:lineRule="auto"/>
+              <w:jc w:val="center"/>
+              <w:rPr>
+                <w:rFonts w:ascii="Arial" w:eastAsia="Times New Roman" w:hAnsi="Arial" w:cs="Arial"/>
+                <w:b/>
+                <w:bCs/>
+                <w:sz w:val="21"/>
+                <w:szCs w:val="21"/>
+                <w:lang w:eastAsia="es-AR"/>
+              </w:rPr>
+            </w:pPr>
+            <w:r>
+              <w:rPr>
+                <w:rFonts w:ascii="Arial" w:eastAsia="Times New Roman" w:hAnsi="Arial" w:cs="Arial"/>
+                <w:b/>
+                <w:bCs/>
+                <w:sz w:val="21"/>
+                <w:szCs w:val="21"/>
+                <w:lang w:eastAsia="es-AR"/>
+              </w:rPr>
+              <w:t>Git</w:t>
+            </w:r>
+          </w:p>
+        </w:tc>
+        <w:tc>
+          <w:tcPr>
+            <w:tcW w:w="0" w:type="auto"/>
+            <w:tcBorders>
+              <w:bottom w:val="single" w:sz="6" w:space="0" w:color="DCDFE5"/>
+            </w:tcBorders>
+            <w:vAlign w:val="center"/>
+            <w:hideMark/>
+          </w:tcPr>
+          <w:p>
+            <w:pPr>
+              <w:spacing w:after="0" w:line="240" w:lineRule="auto"/>
+              <w:jc w:val="center"/>
+              <w:rPr>
+                <w:rFonts w:ascii="Arial" w:eastAsia="Times New Roman" w:hAnsi="Arial" w:cs="Arial"/>
+                <w:b/>
+                <w:bCs/>
+                <w:sz w:val="21"/>
+                <w:szCs w:val="21"/>
+                <w:lang w:eastAsia="es-AR"/>
+              </w:rPr>
+            </w:pPr>
+            <w:r>
+              <w:rPr>
+                <w:rFonts w:ascii="Arial" w:eastAsia="Times New Roman" w:hAnsi="Arial" w:cs="Arial"/>
+                <w:b/>
+                <w:bCs/>
+                <w:sz w:val="21"/>
+                <w:szCs w:val="21"/>
+                <w:lang w:eastAsia="es-AR"/>
+              </w:rPr>
+              <w:t>GitHub</w:t>
+            </w:r>
+          </w:p>
+        </w:tc>
+      </w:tr>
+      <w:tr>
+        <w:trPr>
+          <w:tblCellSpacing w:w="15" w:type="dxa"/>
+        </w:trPr>
+        <w:tc>
+          <w:tcPr>
+            <w:tcW w:w="0" w:type="auto"/>
+            <w:tcBorders>
+              <w:bottom w:val="single" w:sz="6" w:space="0" w:color="DCDFE5"/>
+            </w:tcBorders>
+            <w:vAlign w:val="center"/>
+            <w:hideMark/>
+          </w:tcPr>
+          <w:p>
+            <w:pPr>
+              <w:spacing w:after="0" w:line="240" w:lineRule="auto"/>
+              <w:rPr>
+                <w:rFonts w:ascii="Arial" w:eastAsia="Times New Roman" w:hAnsi="Arial" w:cs="Arial"/>
+                <w:sz w:val="21"/>
+                <w:szCs w:val="21"/>
+                <w:lang w:eastAsia="es-AR"/>
+              </w:rPr>
+            </w:pPr>
+            <w:r>
+              <w:rPr>
+                <w:rFonts w:ascii="Arial" w:eastAsia="Times New Roman" w:hAnsi="Arial" w:cs="Arial"/>
+                <w:b/>
+                <w:bCs/>
+                <w:sz w:val="21"/>
+                <w:szCs w:val="21"/>
+                <w:lang w:eastAsia="es-AR"/>
+              </w:rPr>
+              <w:t>¿Qué es?</w:t>
+            </w:r>
+          </w:p>
+        </w:tc>
+        <w:tc>
+          <w:tcPr>
+            <w:tcW w:w="0" w:type="auto"/>
+            <w:tcBorders>
+              <w:bottom w:val="single" w:sz="6" w:space="0" w:color="DCDFE5"/>
+            </w:tcBorders>
+            <w:vAlign w:val="center"/>
+            <w:hideMark/>
+          </w:tcPr>
+          <w:p>
+            <w:pPr>
+              <w:spacing w:after="0" w:line="240" w:lineRule="auto"/>
+              <w:rPr>
+                <w:rFonts w:ascii="Arial" w:eastAsia="Times New Roman" w:hAnsi="Arial" w:cs="Arial"/>
+                <w:sz w:val="21"/>
+                <w:szCs w:val="21"/>
+                <w:lang w:eastAsia="es-AR"/>
+              </w:rPr>
+            </w:pPr>
+            <w:r>
+              <w:rPr>
+                <w:rFonts w:ascii="Arial" w:eastAsia="Times New Roman" w:hAnsi="Arial" w:cs="Arial"/>
+                <w:sz w:val="21"/>
+                <w:szCs w:val="21"/>
+                <w:lang w:eastAsia="es-AR"/>
+              </w:rPr>
+              <w:t>Un software de línea de comandos.</w:t>
+            </w:r>
+          </w:p>
+        </w:tc>
+        <w:tc>
+          <w:tcPr>
+            <w:tcW w:w="0" w:type="auto"/>
+            <w:tcBorders>
+              <w:bottom w:val="single" w:sz="6" w:space="0" w:color="DCDFE5"/>
+            </w:tcBorders>
+            <w:vAlign w:val="center"/>
+            <w:hideMark/>
+          </w:tcPr>
+          <w:p>
+            <w:pPr>
+              <w:spacing w:after="0" w:line="240" w:lineRule="auto"/>
+              <w:rPr>
+                <w:rFonts w:ascii="Arial" w:eastAsia="Times New Roman" w:hAnsi="Arial" w:cs="Arial"/>
+                <w:sz w:val="21"/>
+                <w:szCs w:val="21"/>
+                <w:lang w:eastAsia="es-AR"/>
+              </w:rPr>
+            </w:pPr>
+            <w:r>
+              <w:rPr>
+                <w:rFonts w:ascii="Arial" w:eastAsia="Times New Roman" w:hAnsi="Arial" w:cs="Arial"/>
+                <w:sz w:val="21"/>
+                <w:szCs w:val="21"/>
+                <w:lang w:eastAsia="es-AR"/>
+              </w:rPr>
+              <w:t>Una plataforma y sitio web.</w:t>
+            </w:r>
+          </w:p>
+        </w:tc>
+      </w:tr>
+      <w:tr>
+        <w:trPr>
+          <w:tblCellSpacing w:w="15" w:type="dxa"/>
+        </w:trPr>
+        <w:tc>
+          <w:tcPr>
+            <w:tcW w:w="0" w:type="auto"/>
+            <w:tcBorders>
+              <w:bottom w:val="single" w:sz="6" w:space="0" w:color="DCDFE5"/>
+            </w:tcBorders>
+            <w:vAlign w:val="center"/>
+            <w:hideMark/>
+          </w:tcPr>
+          <w:p>
+            <w:pPr>
+              <w:spacing w:after="0" w:line="240" w:lineRule="auto"/>
+              <w:rPr>
+                <w:rFonts w:ascii="Arial" w:eastAsia="Times New Roman" w:hAnsi="Arial" w:cs="Arial"/>
+                <w:sz w:val="21"/>
+                <w:szCs w:val="21"/>
+                <w:lang w:eastAsia="es-AR"/>
+              </w:rPr>
+            </w:pPr>
+            <w:r>
+              <w:rPr>
+                <w:rFonts w:ascii="Arial" w:eastAsia="Times New Roman" w:hAnsi="Arial" w:cs="Arial"/>
+                <w:b/>
+                <w:bCs/>
+                <w:sz w:val="21"/>
+                <w:szCs w:val="21"/>
+                <w:lang w:eastAsia="es-AR"/>
+              </w:rPr>
+              <w:t>Instalación</w:t>
+            </w:r>
+          </w:p>
+        </w:tc>
+        <w:tc>
+          <w:tcPr>
+            <w:tcW w:w="0" w:type="auto"/>
+            <w:tcBorders>
+              <w:bottom w:val="single" w:sz="6" w:space="0" w:color="DCDFE5"/>
+            </w:tcBorders>
+            <w:vAlign w:val="center"/>
+            <w:hideMark/>
+          </w:tcPr>
+          <w:p>
+            <w:pPr>
+              <w:spacing w:after="0" w:line="240" w:lineRule="auto"/>
+              <w:rPr>
+                <w:rFonts w:ascii="Arial" w:eastAsia="Times New Roman" w:hAnsi="Arial" w:cs="Arial"/>
+                <w:sz w:val="21"/>
+                <w:szCs w:val="21"/>
+                <w:lang w:eastAsia="es-AR"/>
+              </w:rPr>
+            </w:pPr>
+            <w:r>
+              <w:rPr>
+                <w:rFonts w:ascii="Arial" w:eastAsia="Times New Roman" w:hAnsi="Arial" w:cs="Arial"/>
+                <w:sz w:val="21"/>
+                <w:szCs w:val="21"/>
+                <w:lang w:eastAsia="es-AR"/>
+              </w:rPr>
+              <w:t>Local (en tu computadora).</w:t>
+            </w:r>
+          </w:p>
+        </w:tc>
+        <w:tc>
+          <w:tcPr>
+            <w:tcW w:w="0" w:type="auto"/>
+            <w:tcBorders>
+              <w:bottom w:val="single" w:sz="6" w:space="0" w:color="DCDFE5"/>
+            </w:tcBorders>
+            <w:vAlign w:val="center"/>
+            <w:hideMark/>
+          </w:tcPr>
+          <w:p>
+            <w:pPr>
+              <w:spacing w:after="0" w:line="240" w:lineRule="auto"/>
+              <w:rPr>
+                <w:rFonts w:ascii="Arial" w:eastAsia="Times New Roman" w:hAnsi="Arial" w:cs="Arial"/>
+                <w:sz w:val="21"/>
+                <w:szCs w:val="21"/>
+                <w:lang w:eastAsia="es-AR"/>
+              </w:rPr>
+            </w:pPr>
+            <w:r>
+              <w:rPr>
+                <w:rFonts w:ascii="Arial" w:eastAsia="Times New Roman" w:hAnsi="Arial" w:cs="Arial"/>
+                <w:sz w:val="21"/>
+                <w:szCs w:val="21"/>
+                <w:lang w:eastAsia="es-AR"/>
+              </w:rPr>
+              <w:t>Remoto (se accede con navegador).</w:t>
+            </w:r>
+          </w:p>
+        </w:tc>
+      </w:tr>
+      <w:tr>
+        <w:trPr>
+          <w:tblCellSpacing w:w="15" w:type="dxa"/>
+        </w:trPr>
+        <w:tc>
+          <w:tcPr>
+            <w:tcW w:w="0" w:type="auto"/>
+            <w:tcBorders>
+              <w:bottom w:val="single" w:sz="6" w:space="0" w:color="DCDFE5"/>
+            </w:tcBorders>
+            <w:vAlign w:val="center"/>
+            <w:hideMark/>
+          </w:tcPr>
+          <w:p>
+            <w:pPr>
+              <w:spacing w:after="0" w:line="240" w:lineRule="auto"/>
+              <w:rPr>
+                <w:rFonts w:ascii="Arial" w:eastAsia="Times New Roman" w:hAnsi="Arial" w:cs="Arial"/>
+                <w:sz w:val="21"/>
+                <w:szCs w:val="21"/>
+                <w:lang w:eastAsia="es-AR"/>
+              </w:rPr>
+            </w:pPr>
+            <w:r>
+              <w:rPr>
+                <w:rFonts w:ascii="Arial" w:eastAsia="Times New Roman" w:hAnsi="Arial" w:cs="Arial"/>
+                <w:b/>
+                <w:bCs/>
+                <w:sz w:val="21"/>
+                <w:szCs w:val="21"/>
+                <w:lang w:eastAsia="es-AR"/>
+              </w:rPr>
+              <w:t>Internet</w:t>
+            </w:r>
+          </w:p>
+        </w:tc>
+        <w:tc>
+          <w:tcPr>
+            <w:tcW w:w="0" w:type="auto"/>
+            <w:tcBorders>
+              <w:bottom w:val="single" w:sz="6" w:space="0" w:color="DCDFE5"/>
+            </w:tcBorders>
+            <w:vAlign w:val="center"/>
+            <w:hideMark/>
+          </w:tcPr>
+          <w:p>
+            <w:pPr>
+              <w:spacing w:after="0" w:line="240" w:lineRule="auto"/>
+              <w:rPr>
+                <w:rFonts w:ascii="Arial" w:eastAsia="Times New Roman" w:hAnsi="Arial" w:cs="Arial"/>
+                <w:sz w:val="21"/>
+                <w:szCs w:val="21"/>
+                <w:lang w:eastAsia="es-AR"/>
+              </w:rPr>
+            </w:pPr>
+            <w:r>
+              <w:rPr>
+                <w:rFonts w:ascii="Arial" w:eastAsia="Times New Roman" w:hAnsi="Arial" w:cs="Arial"/>
+                <w:sz w:val="21"/>
+                <w:szCs w:val="21"/>
+                <w:lang w:eastAsia="es-AR"/>
+              </w:rPr>
+              <w:t>No lo necesita para trabajar.</w:t>
+            </w:r>
+          </w:p>
+        </w:tc>
+        <w:tc>
+          <w:tcPr>
+            <w:tcW w:w="0" w:type="auto"/>
+            <w:tcBorders>
+              <w:bottom w:val="single" w:sz="6" w:space="0" w:color="DCDFE5"/>
+            </w:tcBorders>
+            <w:vAlign w:val="center"/>
+            <w:hideMark/>
+          </w:tcPr>
+          <w:p>
+            <w:pPr>
+              <w:spacing w:after="0" w:line="240" w:lineRule="auto"/>
+              <w:rPr>
+                <w:rFonts w:ascii="Arial" w:eastAsia="Times New Roman" w:hAnsi="Arial" w:cs="Arial"/>
+                <w:sz w:val="21"/>
+                <w:szCs w:val="21"/>
+                <w:lang w:eastAsia="es-AR"/>
+              </w:rPr>
+            </w:pPr>
+            <w:r>
+              <w:rPr>
+                <w:rFonts w:ascii="Arial" w:eastAsia="Times New Roman" w:hAnsi="Arial" w:cs="Arial"/>
+                <w:sz w:val="21"/>
+                <w:szCs w:val="21"/>
+                <w:lang w:eastAsia="es-AR"/>
+              </w:rPr>
+              <w:t>Es indispensable para usarlo.</w:t>
+            </w:r>
+          </w:p>
+        </w:tc>
+      </w:tr>
+      <w:tr>
+        <w:trPr>
+          <w:tblCellSpacing w:w="15" w:type="dxa"/>
+        </w:trPr>
+        <w:tc>
+          <w:tcPr>
+            <w:tcW w:w="0" w:type="auto"/>
+            <w:tcBorders>
+              <w:bottom w:val="single" w:sz="6" w:space="0" w:color="DCDFE5"/>
+            </w:tcBorders>
+            <w:vAlign w:val="center"/>
+            <w:hideMark/>
+          </w:tcPr>
+          <w:p>
+            <w:pPr>
+              <w:spacing w:after="0" w:line="240" w:lineRule="auto"/>
+              <w:rPr>
+                <w:rFonts w:ascii="Arial" w:eastAsia="Times New Roman" w:hAnsi="Arial" w:cs="Arial"/>
+                <w:sz w:val="21"/>
+                <w:szCs w:val="21"/>
+                <w:lang w:eastAsia="es-AR"/>
+              </w:rPr>
+            </w:pPr>
+            <w:r>
+              <w:rPr>
+                <w:rFonts w:ascii="Arial" w:eastAsia="Times New Roman" w:hAnsi="Arial" w:cs="Arial"/>
+                <w:b/>
+                <w:bCs/>
+                <w:sz w:val="21"/>
+                <w:szCs w:val="21"/>
+                <w:lang w:eastAsia="es-AR"/>
+              </w:rPr>
+              <w:t>Enfoque</w:t>
+            </w:r>
+          </w:p>
+        </w:tc>
+        <w:tc>
+          <w:tcPr>
+            <w:tcW w:w="0" w:type="auto"/>
+            <w:tcBorders>
+              <w:bottom w:val="single" w:sz="6" w:space="0" w:color="DCDFE5"/>
+            </w:tcBorders>
+            <w:vAlign w:val="center"/>
+            <w:hideMark/>
+          </w:tcPr>
+          <w:p>
+            <w:pPr>
+              <w:spacing w:after="0" w:line="240" w:lineRule="auto"/>
+              <w:rPr>
+                <w:rFonts w:ascii="Arial" w:eastAsia="Times New Roman" w:hAnsi="Arial" w:cs="Arial"/>
+                <w:sz w:val="21"/>
+                <w:szCs w:val="21"/>
+                <w:lang w:eastAsia="es-AR"/>
+              </w:rPr>
+            </w:pPr>
+            <w:r>
+              <w:rPr>
+                <w:rFonts w:ascii="Arial" w:eastAsia="Times New Roman" w:hAnsi="Arial" w:cs="Arial"/>
+                <w:sz w:val="21"/>
+                <w:szCs w:val="21"/>
+                <w:lang w:eastAsia="es-AR"/>
+              </w:rPr>
+              <w:t>Gestión y control de versiones.</w:t>
+            </w:r>
+          </w:p>
+        </w:tc>
+        <w:tc>
+          <w:tcPr>
+            <w:tcW w:w="0" w:type="auto"/>
+            <w:tcBorders>
+              <w:bottom w:val="single" w:sz="6" w:space="0" w:color="DCDFE5"/>
+            </w:tcBorders>
+            <w:vAlign w:val="center"/>
+            <w:hideMark/>
+          </w:tcPr>
+          <w:p>
+            <w:pPr>
+              <w:spacing w:after="0" w:line="240" w:lineRule="auto"/>
+              <w:rPr>
+                <w:rFonts w:ascii="Arial" w:eastAsia="Times New Roman" w:hAnsi="Arial" w:cs="Arial"/>
+                <w:sz w:val="21"/>
+                <w:szCs w:val="21"/>
+                <w:lang w:eastAsia="es-AR"/>
+              </w:rPr>
+            </w:pPr>
+            <w:r>
+              <w:rPr>
+                <w:rFonts w:ascii="Arial" w:eastAsia="Times New Roman" w:hAnsi="Arial" w:cs="Arial"/>
+                <w:sz w:val="21"/>
+                <w:szCs w:val="21"/>
+                <w:lang w:eastAsia="es-AR"/>
+              </w:rPr>
+              <w:t>Compartir, colaborar y gestionar equipos.</w:t>
+            </w:r>
+          </w:p>
+        </w:tc>
+      </w:tr>
+      <w:tr>
+        <w:trPr>
+          <w:tblCellSpacing w:w="15" w:type="dxa"/>
+        </w:trPr>
+        <w:tc>
+          <w:tcPr>
+            <w:tcW w:w="0" w:type="auto"/>
+            <w:tcBorders>
+              <w:bottom w:val="nil"/>
+            </w:tcBorders>
+            <w:vAlign w:val="center"/>
+            <w:hideMark/>
+          </w:tcPr>
+          <w:p>
+            <w:pPr>
+              <w:spacing w:after="0" w:line="240" w:lineRule="auto"/>
+              <w:rPr>
+                <w:rFonts w:ascii="Arial" w:eastAsia="Times New Roman" w:hAnsi="Arial" w:cs="Arial"/>
+                <w:sz w:val="21"/>
+                <w:szCs w:val="21"/>
+                <w:lang w:eastAsia="es-AR"/>
+              </w:rPr>
+            </w:pPr>
+            <w:r>
+              <w:rPr>
+                <w:rFonts w:ascii="Arial" w:eastAsia="Times New Roman" w:hAnsi="Arial" w:cs="Arial"/>
+                <w:b/>
+                <w:bCs/>
+                <w:sz w:val="21"/>
+                <w:szCs w:val="21"/>
+                <w:lang w:eastAsia="es-AR"/>
+              </w:rPr>
+              <w:t>Alternativas</w:t>
+            </w:r>
+          </w:p>
+        </w:tc>
+        <w:tc>
+          <w:tcPr>
+            <w:tcW w:w="0" w:type="auto"/>
+            <w:tcBorders>
+              <w:bottom w:val="nil"/>
+            </w:tcBorders>
+            <w:vAlign w:val="center"/>
+            <w:hideMark/>
+          </w:tcPr>
+          <w:p>
+            <w:pPr>
+              <w:spacing w:after="0" w:line="240" w:lineRule="auto"/>
+              <w:rPr>
+                <w:rFonts w:ascii="Arial" w:eastAsia="Times New Roman" w:hAnsi="Arial" w:cs="Arial"/>
+                <w:sz w:val="21"/>
+                <w:szCs w:val="21"/>
+                <w:lang w:eastAsia="es-AR"/>
+              </w:rPr>
+            </w:pPr>
+            <w:r>
+              <w:rPr>
+                <w:rFonts w:ascii="Arial" w:eastAsia="Times New Roman" w:hAnsi="Arial" w:cs="Arial"/>
+                <w:sz w:val="21"/>
+                <w:szCs w:val="21"/>
+                <w:lang w:eastAsia="es-AR"/>
+              </w:rPr>
+              <w:t>SVN, Mercurial.</w:t>
+            </w:r>
+          </w:p>
+        </w:tc>
+        <w:tc>
+          <w:tcPr>
+            <w:tcW w:w="0" w:type="auto"/>
+            <w:tcBorders>
+              <w:bottom w:val="nil"/>
+            </w:tcBorders>
+            <w:vAlign w:val="center"/>
+            <w:hideMark/>
+          </w:tcPr>
+          <w:p>
+            <w:pPr>
+              <w:spacing w:after="0" w:line="240" w:lineRule="auto"/>
+              <w:rPr>
+                <w:rFonts w:ascii="Arial" w:eastAsia="Times New Roman" w:hAnsi="Arial" w:cs="Arial"/>
+                <w:sz w:val="21"/>
+                <w:szCs w:val="21"/>
+                <w:lang w:eastAsia="es-AR"/>
+              </w:rPr>
+            </w:pPr>
+            <w:r>
+              <w:rPr>
+                <w:rFonts w:ascii="Arial" w:eastAsia="Times New Roman" w:hAnsi="Arial" w:cs="Arial"/>
+                <w:sz w:val="21"/>
+                <w:szCs w:val="21"/>
+                <w:lang w:eastAsia="es-AR"/>
+              </w:rPr>
+              <w:t>GitLab, Bitbucket.</w:t>
+            </w:r>
+          </w:p>
+        </w:tc>
+      </w:tr>
+    </w:tbl>
+    <w:p>
+      <w:pPr>
+        <w:spacing w:line="240" w:lineRule="auto"/>
+        <w:rPr>
+          <w:rFonts w:ascii="Arial" w:eastAsia="Times New Roman" w:hAnsi="Arial" w:cs="Arial"/>
+          <w:sz w:val="24"/>
+          <w:szCs w:val="24"/>
+          <w:lang w:eastAsia="es-AR"/>
+        </w:rPr>
+      </w:pPr>
+      <w:r>
+        <w:rPr>
+          <w:rFonts w:ascii="Arial" w:eastAsia="Times New Roman" w:hAnsi="Arial" w:cs="Arial"/>
+          <w:sz w:val="24"/>
+          <w:szCs w:val="24"/>
+          <w:lang w:eastAsia="es-AR"/>
+        </w:rPr>
+        <w:t>Si estás dando tus primeros pasos y la consola de comandos te resulta intimidante, puedes descargar herramientas visuales oficiales como GitHub Desktop, que te permiten controlar tus version</w:t>
+      </w:r>
+      <w:r>
+        <w:rPr>
+          <w:rFonts w:ascii="Arial" w:eastAsia="Times New Roman" w:hAnsi="Arial" w:cs="Arial"/>
+          <w:sz w:val="24"/>
+          <w:szCs w:val="24"/>
+          <w:lang w:eastAsia="es-AR"/>
+        </w:rPr>
+        <w:t xml:space="preserve">es mediante botones sencillos. </w:t>
+      </w:r>
+    </w:p>
+    <w:p>
+      <w:pPr>
+        <w:spacing w:line="240" w:lineRule="auto"/>
+        <w:rPr>
+          <w:rFonts w:ascii="Arial" w:eastAsia="Times New Roman" w:hAnsi="Arial" w:cs="Arial"/>
+          <w:sz w:val="24"/>
+          <w:szCs w:val="24"/>
+          <w:lang w:eastAsia="es-AR"/>
+        </w:rPr>
+      </w:pPr>
+      <w:r>
+        <w:rPr>
+          <w:rFonts w:ascii="Arial" w:eastAsia="Times New Roman" w:hAnsi="Arial" w:cs="Arial"/>
+          <w:sz w:val="24"/>
+          <w:szCs w:val="24"/>
+          <w:lang w:eastAsia="es-AR"/>
+        </w:rPr>
+        <w:t xml:space="preserve">Si tienes un proyecto en mente, dime si te gustaría aprender los </w:t>
+      </w:r>
+      <w:r>
+        <w:rPr>
+          <w:rFonts w:ascii="Arial" w:eastAsia="Times New Roman" w:hAnsi="Arial" w:cs="Arial"/>
+          <w:b/>
+          <w:bCs/>
+          <w:sz w:val="24"/>
+          <w:szCs w:val="24"/>
+          <w:lang w:eastAsia="es-AR"/>
+        </w:rPr>
+        <w:t>comandos básicos de Git</w:t>
+      </w:r>
+      <w:r>
+        <w:rPr>
+          <w:rFonts w:ascii="Arial" w:eastAsia="Times New Roman" w:hAnsi="Arial" w:cs="Arial"/>
+          <w:sz w:val="24"/>
+          <w:szCs w:val="24"/>
+          <w:lang w:eastAsia="es-AR"/>
+        </w:rPr>
+        <w:t xml:space="preserve"> (como </w:t>
+      </w:r>
+      <w:r>
+        <w:rPr>
+          <w:rFonts w:ascii="Courier New" w:eastAsia="Times New Roman" w:hAnsi="Courier New" w:cs="Courier New"/>
+          <w:sz w:val="21"/>
+          <w:szCs w:val="21"/>
+          <w:lang w:eastAsia="es-AR"/>
+        </w:rPr>
+        <w:t>git init</w:t>
       </w:r>
       <w:bookmarkStart w:id="0" w:name="_GoBack"/>
       <w:bookmarkEnd w:id="0"/>
-      <w:proofErr w:type="spellEnd"/>
+      <w:r>
+        <w:rPr>
+          <w:rFonts w:ascii="Arial" w:eastAsia="Times New Roman" w:hAnsi="Arial" w:cs="Arial"/>
+          <w:sz w:val="24"/>
+          <w:szCs w:val="24"/>
+          <w:lang w:eastAsia="es-AR"/>
+        </w:rPr>
+        <w:t xml:space="preserve">, </w:t>
+      </w:r>
+      <w:r>
+        <w:rPr>
+          <w:rFonts w:ascii="Courier New" w:eastAsia="Times New Roman" w:hAnsi="Courier New" w:cs="Courier New"/>
+          <w:sz w:val="21"/>
+          <w:szCs w:val="21"/>
+          <w:lang w:eastAsia="es-AR"/>
+        </w:rPr>
+        <w:t>git add</w:t>
+      </w:r>
+      <w:r>
+        <w:rPr>
+          <w:rFonts w:ascii="Arial" w:eastAsia="Times New Roman" w:hAnsi="Arial" w:cs="Arial"/>
+          <w:sz w:val="24"/>
+          <w:szCs w:val="24"/>
+          <w:lang w:eastAsia="es-AR"/>
+        </w:rPr>
+        <w:t xml:space="preserve"> o </w:t>
+      </w:r>
+      <w:r>
+        <w:rPr>
+          <w:rFonts w:ascii="Courier New" w:eastAsia="Times New Roman" w:hAnsi="Courier New" w:cs="Courier New"/>
+          <w:sz w:val="21"/>
+          <w:szCs w:val="21"/>
+          <w:lang w:eastAsia="es-AR"/>
+        </w:rPr>
+        <w:t>git commit</w:t>
+      </w:r>
+      <w:r>
+        <w:rPr>
+          <w:rFonts w:ascii="Arial" w:eastAsia="Times New Roman" w:hAnsi="Arial" w:cs="Arial"/>
+          <w:sz w:val="24"/>
+          <w:szCs w:val="24"/>
+          <w:lang w:eastAsia="es-AR"/>
+        </w:rPr>
+        <w:t xml:space="preserve">) o si prefieres ver cómo </w:t>
+      </w:r>
+      <w:r>
+        <w:rPr>
+          <w:rFonts w:ascii="Arial" w:eastAsia="Times New Roman" w:hAnsi="Arial" w:cs="Arial"/>
+          <w:b/>
+          <w:bCs/>
+          <w:sz w:val="24"/>
+          <w:szCs w:val="24"/>
+          <w:lang w:eastAsia="es-AR"/>
+        </w:rPr>
+        <w:t>crear y conectar tu cuenta de GitHub</w:t>
+      </w:r>
+      <w:r>
+        <w:rPr>
+          <w:rFonts w:ascii="Arial" w:eastAsia="Times New Roman" w:hAnsi="Arial" w:cs="Arial"/>
+          <w:sz w:val="24"/>
+          <w:szCs w:val="24"/>
+          <w:lang w:eastAsia="es-AR"/>
+        </w:rPr>
+        <w:t xml:space="preserve">. </w:t>
+      </w:r>
+    </w:p>
+    <w:p>
+      <w:pPr>
+        <w:jc w:val="both"/>
+        <w:rPr>
+          <w:sz w:val="24"/>
+          <w:szCs w:val="24"/>
+          <w:lang w:val="es-MX"/>
+        </w:rPr>
+      </w:pPr>
     </w:p>
     <w:sectPr>
       <w:pgSz w:w="11906" w:h="16838"/>
@@ -50,6 +1299,315 @@
     </w:sectPr>
   </w:body>
 </w:document>
+</file>
+
+<file path=word/numbering.xml><?xml version="1.0" encoding="utf-8"?>
+<w:numbering xmlns:wpc="http://schemas.microsoft.com/office/word/2010/wordprocessingCanvas" xmlns:mc="http://schemas.openxmlformats.org/markup-compatibility/2006" xmlns:o="urn:schemas-microsoft-com:office:office" xmlns:r="http://schemas.openxmlformats.org/officeDocument/2006/relationships" xmlns:m="http://schemas.openxmlformats.org/officeDocument/2006/math" xmlns:v="urn:schemas-microsoft-com:vml" xmlns:wp14="http://schemas.microsoft.com/office/word/2010/wordprocessingDrawing" xmlns:wp="http://schemas.openxmlformats.org/drawingml/2006/wordprocessingDrawing" xmlns:w10="urn:schemas-microsoft-com:office:word" xmlns:w="http://schemas.openxmlformats.org/wordprocessingml/2006/main" xmlns:w14="http://schemas.microsoft.com/office/word/2010/wordml" xmlns:w15="http://schemas.microsoft.com/office/word/2012/wordml" xmlns:wpg="http://schemas.microsoft.com/office/word/2010/wordprocessingGroup" xmlns:wpi="http://schemas.microsoft.com/office/word/2010/wordprocessingInk" xmlns:wne="http://schemas.microsoft.com/office/word/2006/wordml" xmlns:wps="http://schemas.microsoft.com/office/word/2010/wordprocessingShape" mc:Ignorable="w14 w15 wp14">
+  <w:abstractNum w:abstractNumId="0" w15:restartNumberingAfterBreak="0">
+    <w:nsid w:val="22EB540E"/>
+    <w:multiLevelType w:val="multilevel"/>
+    <w:tmpl w:val="CBCA8F4C"/>
+    <w:lvl w:ilvl="0">
+      <w:start w:val="1"/>
+      <w:numFmt w:val="bullet"/>
+      <w:lvlText w:val=""/>
+      <w:lvlJc w:val="left"/>
+      <w:pPr>
+        <w:tabs>
+          <w:tab w:val="num" w:pos="720"/>
+        </w:tabs>
+        <w:ind w:left="720" w:hanging="360"/>
+      </w:pPr>
+      <w:rPr>
+        <w:rFonts w:ascii="Symbol" w:hAnsi="Symbol" w:hint="default"/>
+        <w:sz w:val="20"/>
+      </w:rPr>
+    </w:lvl>
+    <w:lvl w:ilvl="1" w:tentative="1">
+      <w:start w:val="1"/>
+      <w:numFmt w:val="bullet"/>
+      <w:lvlText w:val="o"/>
+      <w:lvlJc w:val="left"/>
+      <w:pPr>
+        <w:tabs>
+          <w:tab w:val="num" w:pos="1440"/>
+        </w:tabs>
+        <w:ind w:left="1440" w:hanging="360"/>
+      </w:pPr>
+      <w:rPr>
+        <w:rFonts w:ascii="Courier New" w:hAnsi="Courier New" w:hint="default"/>
+        <w:sz w:val="20"/>
+      </w:rPr>
+    </w:lvl>
+    <w:lvl w:ilvl="2" w:tentative="1">
+      <w:start w:val="1"/>
+      <w:numFmt w:val="bullet"/>
+      <w:lvlText w:val=""/>
+      <w:lvlJc w:val="left"/>
+      <w:pPr>
+        <w:tabs>
+          <w:tab w:val="num" w:pos="2160"/>
+        </w:tabs>
+        <w:ind w:left="2160" w:hanging="360"/>
+      </w:pPr>
+      <w:rPr>
+        <w:rFonts w:ascii="Wingdings" w:hAnsi="Wingdings" w:hint="default"/>
+        <w:sz w:val="20"/>
+      </w:rPr>
+    </w:lvl>
+    <w:lvl w:ilvl="3" w:tentative="1">
+      <w:start w:val="1"/>
+      <w:numFmt w:val="bullet"/>
+      <w:lvlText w:val=""/>
+      <w:lvlJc w:val="left"/>
+      <w:pPr>
+        <w:tabs>
+          <w:tab w:val="num" w:pos="2880"/>
+        </w:tabs>
+        <w:ind w:left="2880" w:hanging="360"/>
+      </w:pPr>
+      <w:rPr>
+        <w:rFonts w:ascii="Wingdings" w:hAnsi="Wingdings" w:hint="default"/>
+        <w:sz w:val="20"/>
+      </w:rPr>
+    </w:lvl>
+    <w:lvl w:ilvl="4" w:tentative="1">
+      <w:start w:val="1"/>
+      <w:numFmt w:val="bullet"/>
+      <w:lvlText w:val=""/>
+      <w:lvlJc w:val="left"/>
+      <w:pPr>
+        <w:tabs>
+          <w:tab w:val="num" w:pos="3600"/>
+        </w:tabs>
+        <w:ind w:left="3600" w:hanging="360"/>
+      </w:pPr>
+      <w:rPr>
+        <w:rFonts w:ascii="Wingdings" w:hAnsi="Wingdings" w:hint="default"/>
+        <w:sz w:val="20"/>
+      </w:rPr>
+    </w:lvl>
+    <w:lvl w:ilvl="5" w:tentative="1">
+      <w:start w:val="1"/>
+      <w:numFmt w:val="bullet"/>
+      <w:lvlText w:val=""/>
+      <w:lvlJc w:val="left"/>
+      <w:pPr>
+        <w:tabs>
+          <w:tab w:val="num" w:pos="4320"/>
+        </w:tabs>
+        <w:ind w:left="4320" w:hanging="360"/>
+      </w:pPr>
+      <w:rPr>
+        <w:rFonts w:ascii="Wingdings" w:hAnsi="Wingdings" w:hint="default"/>
+        <w:sz w:val="20"/>
+      </w:rPr>
+    </w:lvl>
+    <w:lvl w:ilvl="6" w:tentative="1">
+      <w:start w:val="1"/>
+      <w:numFmt w:val="bullet"/>
+      <w:lvlText w:val=""/>
+      <w:lvlJc w:val="left"/>
+      <w:pPr>
+        <w:tabs>
+          <w:tab w:val="num" w:pos="5040"/>
+        </w:tabs>
+        <w:ind w:left="5040" w:hanging="360"/>
+      </w:pPr>
+      <w:rPr>
+        <w:rFonts w:ascii="Wingdings" w:hAnsi="Wingdings" w:hint="default"/>
+        <w:sz w:val="20"/>
+      </w:rPr>
+    </w:lvl>
+    <w:lvl w:ilvl="7" w:tentative="1">
+      <w:start w:val="1"/>
+      <w:numFmt w:val="bullet"/>
+      <w:lvlText w:val=""/>
+      <w:lvlJc w:val="left"/>
+      <w:pPr>
+        <w:tabs>
+          <w:tab w:val="num" w:pos="5760"/>
+        </w:tabs>
+        <w:ind w:left="5760" w:hanging="360"/>
+      </w:pPr>
+      <w:rPr>
+        <w:rFonts w:ascii="Wingdings" w:hAnsi="Wingdings" w:hint="default"/>
+        <w:sz w:val="20"/>
+      </w:rPr>
+    </w:lvl>
+    <w:lvl w:ilvl="8" w:tentative="1">
+      <w:start w:val="1"/>
+      <w:numFmt w:val="bullet"/>
+      <w:lvlText w:val=""/>
+      <w:lvlJc w:val="left"/>
+      <w:pPr>
+        <w:tabs>
+          <w:tab w:val="num" w:pos="6480"/>
+        </w:tabs>
+        <w:ind w:left="6480" w:hanging="360"/>
+      </w:pPr>
+      <w:rPr>
+        <w:rFonts w:ascii="Wingdings" w:hAnsi="Wingdings" w:hint="default"/>
+        <w:sz w:val="20"/>
+      </w:rPr>
+    </w:lvl>
+  </w:abstractNum>
+  <w:abstractNum w:abstractNumId="1" w15:restartNumberingAfterBreak="0">
+    <w:nsid w:val="5C4E5731"/>
+    <w:multiLevelType w:val="multilevel"/>
+    <w:tmpl w:val="89B447B0"/>
+    <w:lvl w:ilvl="0">
+      <w:start w:val="1"/>
+      <w:numFmt w:val="bullet"/>
+      <w:lvlText w:val=""/>
+      <w:lvlJc w:val="left"/>
+      <w:pPr>
+        <w:tabs>
+          <w:tab w:val="num" w:pos="720"/>
+        </w:tabs>
+        <w:ind w:left="720" w:hanging="360"/>
+      </w:pPr>
+      <w:rPr>
+        <w:rFonts w:ascii="Symbol" w:hAnsi="Symbol" w:hint="default"/>
+        <w:sz w:val="20"/>
+      </w:rPr>
+    </w:lvl>
+    <w:lvl w:ilvl="1" w:tentative="1">
+      <w:start w:val="1"/>
+      <w:numFmt w:val="bullet"/>
+      <w:lvlText w:val="o"/>
+      <w:lvlJc w:val="left"/>
+      <w:pPr>
+        <w:tabs>
+          <w:tab w:val="num" w:pos="1440"/>
+        </w:tabs>
+        <w:ind w:left="1440" w:hanging="360"/>
+      </w:pPr>
+      <w:rPr>
+        <w:rFonts w:ascii="Courier New" w:hAnsi="Courier New" w:hint="default"/>
+        <w:sz w:val="20"/>
+      </w:rPr>
+    </w:lvl>
+    <w:lvl w:ilvl="2" w:tentative="1">
+      <w:start w:val="1"/>
+      <w:numFmt w:val="bullet"/>
+      <w:lvlText w:val=""/>
+      <w:lvlJc w:val="left"/>
+      <w:pPr>
+        <w:tabs>
+          <w:tab w:val="num" w:pos="2160"/>
+        </w:tabs>
+        <w:ind w:left="2160" w:hanging="360"/>
+      </w:pPr>
+      <w:rPr>
+        <w:rFonts w:ascii="Wingdings" w:hAnsi="Wingdings" w:hint="default"/>
+        <w:sz w:val="20"/>
+      </w:rPr>
+    </w:lvl>
+    <w:lvl w:ilvl="3" w:tentative="1">
+      <w:start w:val="1"/>
+      <w:numFmt w:val="bullet"/>
+      <w:lvlText w:val=""/>
+      <w:lvlJc w:val="left"/>
+      <w:pPr>
+        <w:tabs>
+          <w:tab w:val="num" w:pos="2880"/>
+        </w:tabs>
+        <w:ind w:left="2880" w:hanging="360"/>
+      </w:pPr>
+      <w:rPr>
+        <w:rFonts w:ascii="Wingdings" w:hAnsi="Wingdings" w:hint="default"/>
+        <w:sz w:val="20"/>
+      </w:rPr>
+    </w:lvl>
+    <w:lvl w:ilvl="4" w:tentative="1">
+      <w:start w:val="1"/>
+      <w:numFmt w:val="bullet"/>
+      <w:lvlText w:val=""/>
+      <w:lvlJc w:val="left"/>
+      <w:pPr>
+        <w:tabs>
+          <w:tab w:val="num" w:pos="3600"/>
+        </w:tabs>
+        <w:ind w:left="3600" w:hanging="360"/>
+      </w:pPr>
+      <w:rPr>
+        <w:rFonts w:ascii="Wingdings" w:hAnsi="Wingdings" w:hint="default"/>
+        <w:sz w:val="20"/>
+      </w:rPr>
+    </w:lvl>
+    <w:lvl w:ilvl="5" w:tentative="1">
+      <w:start w:val="1"/>
+      <w:numFmt w:val="bullet"/>
+      <w:lvlText w:val=""/>
+      <w:lvlJc w:val="left"/>
+      <w:pPr>
+        <w:tabs>
+          <w:tab w:val="num" w:pos="4320"/>
+        </w:tabs>
+        <w:ind w:left="4320" w:hanging="360"/>
+      </w:pPr>
+      <w:rPr>
+        <w:rFonts w:ascii="Wingdings" w:hAnsi="Wingdings" w:hint="default"/>
+        <w:sz w:val="20"/>
+      </w:rPr>
+    </w:lvl>
+    <w:lvl w:ilvl="6" w:tentative="1">
+      <w:start w:val="1"/>
+      <w:numFmt w:val="bullet"/>
+      <w:lvlText w:val=""/>
+      <w:lvlJc w:val="left"/>
+      <w:pPr>
+        <w:tabs>
+          <w:tab w:val="num" w:pos="5040"/>
+        </w:tabs>
+        <w:ind w:left="5040" w:hanging="360"/>
+      </w:pPr>
+      <w:rPr>
+        <w:rFonts w:ascii="Wingdings" w:hAnsi="Wingdings" w:hint="default"/>
+        <w:sz w:val="20"/>
+      </w:rPr>
+    </w:lvl>
+    <w:lvl w:ilvl="7" w:tentative="1">
+      <w:start w:val="1"/>
+      <w:numFmt w:val="bullet"/>
+      <w:lvlText w:val=""/>
+      <w:lvlJc w:val="left"/>
+      <w:pPr>
+        <w:tabs>
+          <w:tab w:val="num" w:pos="5760"/>
+        </w:tabs>
+        <w:ind w:left="5760" w:hanging="360"/>
+      </w:pPr>
+      <w:rPr>
+        <w:rFonts w:ascii="Wingdings" w:hAnsi="Wingdings" w:hint="default"/>
+        <w:sz w:val="20"/>
+      </w:rPr>
+    </w:lvl>
+    <w:lvl w:ilvl="8" w:tentative="1">
+      <w:start w:val="1"/>
+      <w:numFmt w:val="bullet"/>
+      <w:lvlText w:val=""/>
+      <w:lvlJc w:val="left"/>
+      <w:pPr>
+        <w:tabs>
+          <w:tab w:val="num" w:pos="6480"/>
+        </w:tabs>
+        <w:ind w:left="6480" w:hanging="360"/>
+      </w:pPr>
+      <w:rPr>
+        <w:rFonts w:ascii="Wingdings" w:hAnsi="Wingdings" w:hint="default"/>
+        <w:sz w:val="20"/>
+      </w:rPr>
+    </w:lvl>
+  </w:abstractNum>
+  <w:num w:numId="1">
+    <w:abstractNumId w:val="1"/>
+  </w:num>
+  <w:num w:numId="2">
+    <w:abstractNumId w:val="0"/>
+  </w:num>
+</w:numbering>
 </file>
 
 <file path=word/styles.xml><?xml version="1.0" encoding="utf-8"?>
@@ -473,6 +2031,58 @@
     <w:semiHidden/>
     <w:unhideWhenUsed/>
   </w:style>
+  <w:style w:type="character" w:customStyle="1" w:styleId="t286pc">
+    <w:name w:val="t286pc"/>
+    <w:basedOn w:val="Fuentedeprrafopredeter"/>
+    <w:rsid w:val="00A233B7"/>
+  </w:style>
+  <w:style w:type="character" w:styleId="Textoennegrita">
+    <w:name w:val="Strong"/>
+    <w:basedOn w:val="Fuentedeprrafopredeter"/>
+    <w:uiPriority w:val="22"/>
+    <w:qFormat/>
+    <w:rsid w:val="00A233B7"/>
+    <w:rPr>
+      <w:b/>
+      <w:bCs/>
+    </w:rPr>
+  </w:style>
+  <w:style w:type="character" w:styleId="Hipervnculo">
+    <w:name w:val="Hyperlink"/>
+    <w:basedOn w:val="Fuentedeprrafopredeter"/>
+    <w:uiPriority w:val="99"/>
+    <w:semiHidden/>
+    <w:unhideWhenUsed/>
+    <w:rsid w:val="00A233B7"/>
+    <w:rPr>
+      <w:color w:val="0000FF"/>
+      <w:u w:val="single"/>
+    </w:rPr>
+  </w:style>
+  <w:style w:type="character" w:styleId="nfasis">
+    <w:name w:val="Emphasis"/>
+    <w:basedOn w:val="Fuentedeprrafopredeter"/>
+    <w:uiPriority w:val="20"/>
+    <w:qFormat/>
+    <w:rsid w:val="00A233B7"/>
+    <w:rPr>
+      <w:i/>
+      <w:iCs/>
+    </w:rPr>
+  </w:style>
+  <w:style w:type="character" w:styleId="CdigoHTML">
+    <w:name w:val="HTML Code"/>
+    <w:basedOn w:val="Fuentedeprrafopredeter"/>
+    <w:uiPriority w:val="99"/>
+    <w:semiHidden/>
+    <w:unhideWhenUsed/>
+    <w:rsid w:val="00A233B7"/>
+    <w:rPr>
+      <w:rFonts w:ascii="Courier New" w:eastAsia="Times New Roman" w:hAnsi="Courier New" w:cs="Courier New"/>
+      <w:sz w:val="20"/>
+      <w:szCs w:val="20"/>
+    </w:rPr>
+  </w:style>
 </w:styles>
 </file>
 

</xml_diff>